<commit_message>
Add linked contents and grant overview to APFAF brief
Co-authored-by: arena-agent <297053741+arena-agent@users.noreply.github.com>
</commit_message>
<xml_diff>
--- a/APFAF_Kampala_EbA_Concept_Development_Brief.docx
+++ b/APFAF_Kampala_EbA_Concept_Development_Brief.docx
@@ -15,7 +15,7 @@
     </w:p>
     <w:p>
       <w:pPr>
-        <w:pStyle w:val="Heading1"/>
+        <w:pStyle w:val="Subtitle"/>
       </w:pPr>
       <w:r>
         <w:rPr>
@@ -124,29 +124,230 @@
     </w:p>
     <w:p>
       <w:pPr>
-        <w:pStyle w:val="Heading1"/>
+        <w:pStyle w:val="TOCHeading"/>
       </w:pPr>
       <w:r>
-        <w:rPr>
-          <w:b w:val="0"/>
-        </w:rPr>
-        <w:t>1. Purpose of this brief</w:t>
+        <w:t>Table of contents</w:t>
       </w:r>
     </w:p>
     <w:p>
       <w:r>
-        <w:rPr>
-          <w:b w:val="0"/>
-        </w:rPr>
-        <w:t>This document gives APFAF’s team a common basis for developing the actual application. It provides a proposed project direction, draft narrative, evidence requirements, results framework, partnership structure, budget envelope and writing assignments.</w:t>
+        <w:t>Click a section title to navigate (Ctrl+click in some Word versions). The contents list uses section links rather than page numbers so it remains useful as the team edits the draft.</w:t>
       </w:r>
     </w:p>
     <w:p>
-      <w:r>
-        <w:rPr>
-          <w:b w:val="0"/>
-        </w:rPr>
-        <w:t>The team should distinguish throughout the application between:</w:t>
+      <w:hyperlink w:anchor="APFAF_section_1">
+        <w:r>
+          <w:rPr>
+            <w:color w:val="165A51"/>
+          </w:rPr>
+          <w:t>1. What the Global EbA Fund grant is all about</w:t>
+        </w:r>
+      </w:hyperlink>
+    </w:p>
+    <w:p>
+      <w:hyperlink w:anchor="APFAF_section_2">
+        <w:r>
+          <w:rPr>
+            <w:color w:val="165A51"/>
+          </w:rPr>
+          <w:t>2. Purpose of this brief</w:t>
+        </w:r>
+      </w:hyperlink>
+    </w:p>
+    <w:p>
+      <w:hyperlink w:anchor="APFAF_section_3">
+        <w:r>
+          <w:rPr>
+            <w:color w:val="165A51"/>
+          </w:rPr>
+          <w:t>3. Executive concept summary</w:t>
+        </w:r>
+      </w:hyperlink>
+    </w:p>
+    <w:p>
+      <w:hyperlink w:anchor="APFAF_section_4">
+        <w:r>
+          <w:rPr>
+            <w:color w:val="165A51"/>
+          </w:rPr>
+          <w:t>4. Why this concept fits APFAF</w:t>
+        </w:r>
+      </w:hyperlink>
+    </w:p>
+    <w:p>
+      <w:hyperlink w:anchor="APFAF_section_5">
+        <w:r>
+          <w:rPr>
+            <w:color w:val="165A51"/>
+          </w:rPr>
+          <w:t>5. Mandatory concept-validation gates</w:t>
+        </w:r>
+      </w:hyperlink>
+    </w:p>
+    <w:p>
+      <w:hyperlink w:anchor="APFAF_section_6">
+        <w:r>
+          <w:rPr>
+            <w:color w:val="165A51"/>
+          </w:rPr>
+          <w:t>6. Problem statement: writing instructions</w:t>
+        </w:r>
+      </w:hyperlink>
+    </w:p>
+    <w:p>
+      <w:hyperlink w:anchor="APFAF_section_7">
+        <w:r>
+          <w:rPr>
+            <w:color w:val="165A51"/>
+          </w:rPr>
+          <w:t>7. Theory of change</w:t>
+        </w:r>
+      </w:hyperlink>
+    </w:p>
+    <w:p>
+      <w:hyperlink w:anchor="APFAF_section_8">
+        <w:r>
+          <w:rPr>
+            <w:color w:val="165A51"/>
+          </w:rPr>
+          <w:t>8. Proposed results framework</w:t>
+        </w:r>
+      </w:hyperlink>
+    </w:p>
+    <w:p>
+      <w:hyperlink w:anchor="APFAF_section_9">
+        <w:r>
+          <w:rPr>
+            <w:color w:val="165A51"/>
+          </w:rPr>
+          <w:t>9. Partner and governance structure</w:t>
+        </w:r>
+      </w:hyperlink>
+    </w:p>
+    <w:p>
+      <w:hyperlink w:anchor="APFAF_section_10">
+        <w:r>
+          <w:rPr>
+            <w:color w:val="165A51"/>
+          </w:rPr>
+          <w:t>10. Safeguards, rights and inclusion</w:t>
+        </w:r>
+      </w:hyperlink>
+    </w:p>
+    <w:p>
+      <w:hyperlink w:anchor="APFAF_section_11">
+        <w:r>
+          <w:rPr>
+            <w:color w:val="165A51"/>
+          </w:rPr>
+          <w:t>11. Implementation sequence</w:t>
+        </w:r>
+      </w:hyperlink>
+    </w:p>
+    <w:p>
+      <w:hyperlink w:anchor="APFAF_section_12">
+        <w:r>
+          <w:rPr>
+            <w:color w:val="165A51"/>
+          </w:rPr>
+          <w:t>12. Illustrative budget envelope</w:t>
+        </w:r>
+      </w:hyperlink>
+    </w:p>
+    <w:p>
+      <w:hyperlink w:anchor="APFAF_section_13">
+        <w:r>
+          <w:rPr>
+            <w:color w:val="165A51"/>
+          </w:rPr>
+          <w:t>13. Sustainability and exit strategy</w:t>
+        </w:r>
+      </w:hyperlink>
+    </w:p>
+    <w:p>
+      <w:hyperlink w:anchor="APFAF_section_14">
+        <w:r>
+          <w:rPr>
+            <w:color w:val="165A51"/>
+          </w:rPr>
+          <w:t>14. Evidence and writing assignments</w:t>
+        </w:r>
+      </w:hyperlink>
+    </w:p>
+    <w:p>
+      <w:hyperlink w:anchor="APFAF_section_15">
+        <w:r>
+          <w:rPr>
+            <w:color w:val="165A51"/>
+          </w:rPr>
+          <w:t>15. Application preparation and deadline plan</w:t>
+        </w:r>
+      </w:hyperlink>
+    </w:p>
+    <w:p>
+      <w:hyperlink w:anchor="APFAF_section_16">
+        <w:r>
+          <w:rPr>
+            <w:color w:val="165A51"/>
+          </w:rPr>
+          <w:t>16. Final review and go/no-go decision</w:t>
+        </w:r>
+      </w:hyperlink>
+    </w:p>
+    <w:p>
+      <w:hyperlink w:anchor="APFAF_section_17">
+        <w:r>
+          <w:rPr>
+            <w:color w:val="165A51"/>
+          </w:rPr>
+          <w:t>17. Source register</w:t>
+        </w:r>
+      </w:hyperlink>
+    </w:p>
+    <w:p>
+      <w:bookmarkStart w:id="1" w:name="APFAF_section_1"/>
+      <w:pPr>
+        <w:pStyle w:val="Heading1"/>
+        <w:pageBreakBefore/>
+      </w:pPr>
+      <w:r>
+        <w:t>1. What the Global EbA Fund grant is all about</w:t>
+      </w:r>
+      <w:bookmarkEnd w:id="1"/>
+    </w:p>
+    <w:p>
+      <w:pPr/>
+      <w:r>
+        <w:t>The Global Ecosystem-based Adaptation (EbA) Fund supports innovative projects that remove barriers to using biodiversity and ecosystem services to help people adapt to climate change. It is implemented by IUCN and the United Nations Environment Programme, with support from Germany’s International Climate Initiative (IKI). This is targeted adaptation funding, not a general NGO operating grant, education fund or health-service grant.</w:t>
+      </w:r>
+    </w:p>
+    <w:p>
+      <w:pPr>
+        <w:pStyle w:val="Heading2"/>
+      </w:pPr>
+      <w:r>
+        <w:t>What ecosystem-based adaptation means</w:t>
+      </w:r>
+    </w:p>
+    <w:p>
+      <w:pPr/>
+      <w:r>
+        <w:t>EbA uses the conservation, restoration and sustainable management of ecosystems as part of a wider climate-adaptation strategy. For example, technically appropriate management of a wetland or catchment may support water regulation and help reduce climate vulnerability. A proposal must identify the climate hazard, vulnerable people, relevant ecosystem service and credible route to adaptation benefits. Tree planting, pollution awareness or conservation alone does not automatically qualify.</w:t>
+      </w:r>
+    </w:p>
+    <w:p>
+      <w:pPr>
+        <w:pStyle w:val="Heading2"/>
+      </w:pPr>
+      <w:r>
+        <w:t>The 2026 funding announcement and its two windows</w:t>
+      </w:r>
+    </w:p>
+    <w:p>
+      <w:pPr/>
+      <w:r>
+        <w:t>The announcement offers up to USD 7.5 million across two calls—not USD 7.5 million to a single applicant. The detailed call documents envisage 10 small grants of up to USD 250,000 each and 10 medium grants of up to USD 500,000 each. These are competitive awards, not guaranteed allocations.</w:t>
       </w:r>
     </w:p>
     <w:p>
@@ -154,21 +355,7 @@
         <w:pStyle w:val="ListBullet"/>
       </w:pPr>
       <w:r>
-        <w:rPr>
-          <w:b w:val="0"/>
-        </w:rPr>
-      </w:r>
-      <w:r>
-        <w:rPr>
-          <w:b/>
-        </w:rPr>
-        <w:t>Published organisational information:</w:t>
-      </w:r>
-      <w:r>
-        <w:rPr>
-          <w:b w:val="0"/>
-        </w:rPr>
-        <w:t xml:space="preserve"> what APFAF’s website states about its mandate and activities.</w:t>
+        <w:t>Small-size grants: applications from 28 September to 26 October 2026. The detailed call specifies 18–24 months, while the webpage says up to 24 months. This brief proposes 24 months. The geographic emphasis is on ODA-eligible Small Island Developing States and Least Developed Countries; exceptional proposals from other ODA-eligible countries may be considered.</w:t>
       </w:r>
     </w:p>
     <w:p>
@@ -176,21 +363,119 @@
         <w:pStyle w:val="ListBullet"/>
       </w:pPr>
       <w:r>
+        <w:t>Medium-size grants: applications from 12 October to 16 November 2026, for projects up to 24 months. The call highlights innovative finance; human development and security; and synergies across climate, biodiversity and land agendas. These are themes within the medium window, not three separate grant programmes, and alignment with one is encouraged rather than compulsory.</w:t>
+      </w:r>
+    </w:p>
+    <w:p>
+      <w:pPr/>
+      <w:r>
+        <w:t>These dates reflect the published 2026 calls reviewed on 10 October 2026. Confirm the exact closing time, time zone, live portal requirements and any amendments before submission.</w:t>
+      </w:r>
+    </w:p>
+    <w:p>
+      <w:pPr>
+        <w:pStyle w:val="Heading2"/>
+      </w:pPr>
+      <w:r>
+        <w:t>What the Fund wants to finance</w:t>
+      </w:r>
+    </w:p>
+    <w:p>
+      <w:pPr/>
+      <w:r>
+        <w:t>The Fund prioritises changes that enable EbA to spread and last: better evidence, practical institutional capacity, inclusive governance, effective policies, learning arrangements and investment readiness. Projects must build on existing work and demonstrate innovation, potential for wider uptake, and a credible exit strategy.</w:t>
+      </w:r>
+    </w:p>
+    <w:p>
+      <w:pPr/>
+      <w:r>
+        <w:t>The small call encourages investment-ready project pipelines, tested technologies adapted or scaled for EbA, practical research that resolves implementation barriers, and synergies with existing EbA or nature-based solutions initiatives. A proposal should select a focused approach rather than attempt to cover every topic.</w:t>
+      </w:r>
+    </w:p>
+    <w:p>
+      <w:pPr>
+        <w:pStyle w:val="Heading2"/>
+      </w:pPr>
+      <w:r>
+        <w:t>Who can apply and the main restrictions</w:t>
+      </w:r>
+    </w:p>
+    <w:p>
+      <w:pPr/>
+      <w:r>
+        <w:t>Eligible categories include legally recognised NGOs, community-based organisations, Indigenous Peoples’ organisations, universities, research institutions, intergovernmental organisations, certain private-sector applicants and consortia. Applicants must demonstrate relevant experience, financial and technical capacity, local partnerships and the legal ability to operate. Country-specific projects must target ODA-eligible countries at application.</w:t>
+      </w:r>
+    </w:p>
+    <w:p>
+      <w:pPr/>
+      <w:r>
+        <w:t>The Fund does not support projects primarily devoted to field implementation, standalone business-as-usual activities or direct seed-grant programmes. Government institutions may collaborate but cannot receive direct grants or sub-grants. Private-sector participation is subject to public-interest and non-profit-project restrictions. The manual also excludes projects classified as high environmental and social risk.</w:t>
+      </w:r>
+    </w:p>
+    <w:p>
+      <w:pPr>
+        <w:pStyle w:val="Heading2"/>
+      </w:pPr>
+      <w:r>
+        <w:t>How proposals are assessed</w:t>
+      </w:r>
+    </w:p>
+    <w:p>
+      <w:pPr/>
+      <w:r>
+        <w:t>Published evaluation weights are: project approach—including EbA fit, methodology and gender/social inclusion—40%; innovation and catalytic contribution 20%; sustainability 20%; and institutional arrangements and budget 20%. Applicants must choose one strategic objective, comply with the action-pillar selection rules, and include at least three relevant Fund core indicators.</w:t>
+      </w:r>
+    </w:p>
+    <w:p>
+      <w:pPr>
+        <w:pStyle w:val="Heading2"/>
+      </w:pPr>
+      <w:r>
+        <w:t>Why APFAF is prioritising the small window</w:t>
+      </w:r>
+    </w:p>
+    <w:p>
+      <w:pPr/>
+      <w:r>
+        <w:t>APFAF’s stated climate-justice, health-equity and legal-protection mandate offers a plausible contribution to inclusive ecosystem governance. Its reported 2024 Kampala survey may provide an entry point for a focused evidence-and-capacity project, but the survey must be reviewed and a qualified technical partner secured. The small window is the recommended starting point because it allows a defined, partnership-based intervention rather than requiring APFAF to claim a broad financing or national-policy platform it has not yet demonstrated.</w:t>
+      </w:r>
+    </w:p>
+    <w:p>
+      <w:pPr/>
+      <w:r>
+        <w:t>Success would mean that responsible institutions and communities use better evidence and workable rights-based arrangements to adopt and sustain EbA—not merely that the project holds meetings, publishes reports or plants trees. APFAF’s eligibility, appropriate grant size and lead-versus-partner role remain subject to verification.</w:t>
+      </w:r>
+    </w:p>
+    <w:p>
+      <w:pPr/>
+      <w:r>
+        <w:t>Sources: small-size grants webpage and call document; Grants Procedure Manual; Core Indicator Framework (source register entries 4–7). Medium-size grants and the overall announcement are added as entries 8–9.</w:t>
+      </w:r>
+    </w:p>
+    <w:p>
+      <w:bookmarkStart w:id="2" w:name="APFAF_section_2"/>
+      <w:pPr>
+        <w:pStyle w:val="Heading1"/>
+      </w:pPr>
+      <w:r>
+        <w:t>2. Purpose of this brief</w:t>
+      </w:r>
+      <w:bookmarkEnd w:id="2"/>
+    </w:p>
+    <w:p>
+      <w:r>
         <w:rPr>
           <w:b w:val="0"/>
         </w:rPr>
-      </w:r>
-      <w:r>
-        <w:rPr>
-          <w:b/>
-        </w:rPr>
-        <w:t>Verified project evidence:</w:t>
-      </w:r>
+        <w:t>This document gives APFAF’s team a common basis for developing the actual application. It provides a proposed project direction, draft narrative, evidence requirements, results framework, partnership structure, budget envelope and writing assignments.</w:t>
+      </w:r>
+    </w:p>
+    <w:p>
       <w:r>
         <w:rPr>
           <w:b w:val="0"/>
         </w:rPr>
-        <w:t xml:space="preserve"> findings supported by reports, data, consultation records or authoritative technical sources.</w:t>
+        <w:t>The team should distinguish throughout the application between:</w:t>
       </w:r>
     </w:p>
     <w:p>
@@ -206,13 +491,13 @@
         <w:rPr>
           <w:b/>
         </w:rPr>
-        <w:t>Proposed activities and targets:</w:t>
+        <w:t>Published organisational information:</w:t>
       </w:r>
       <w:r>
         <w:rPr>
           <w:b w:val="0"/>
         </w:rPr>
-        <w:t xml:space="preserve"> what the new project intends to deliver.</w:t>
+        <w:t xml:space="preserve"> what APFAF’s website states about its mandate and activities.</w:t>
       </w:r>
     </w:p>
     <w:p>
@@ -228,6 +513,50 @@
         <w:rPr>
           <w:b/>
         </w:rPr>
+        <w:t>Verified project evidence:</w:t>
+      </w:r>
+      <w:r>
+        <w:rPr>
+          <w:b w:val="0"/>
+        </w:rPr>
+        <w:t xml:space="preserve"> findings supported by reports, data, consultation records or authoritative technical sources.</w:t>
+      </w:r>
+    </w:p>
+    <w:p>
+      <w:pPr>
+        <w:pStyle w:val="ListBullet"/>
+      </w:pPr>
+      <w:r>
+        <w:rPr>
+          <w:b w:val="0"/>
+        </w:rPr>
+      </w:r>
+      <w:r>
+        <w:rPr>
+          <w:b/>
+        </w:rPr>
+        <w:t>Proposed activities and targets:</w:t>
+      </w:r>
+      <w:r>
+        <w:rPr>
+          <w:b w:val="0"/>
+        </w:rPr>
+        <w:t xml:space="preserve"> what the new project intends to deliver.</w:t>
+      </w:r>
+    </w:p>
+    <w:p>
+      <w:pPr>
+        <w:pStyle w:val="ListBullet"/>
+      </w:pPr>
+      <w:r>
+        <w:rPr>
+          <w:b w:val="0"/>
+        </w:rPr>
+      </w:r>
+      <w:r>
+        <w:rPr>
+          <w:b/>
+        </w:rPr>
         <w:t>Assumptions requiring validation:</w:t>
       </w:r>
       <w:r>
@@ -246,15 +575,14 @@
       </w:r>
     </w:p>
     <w:p>
+      <w:bookmarkStart w:id="3" w:name="APFAF_section_3"/>
       <w:pPr>
         <w:pStyle w:val="Heading1"/>
       </w:pPr>
       <w:r>
-        <w:rPr>
-          <w:b w:val="0"/>
-        </w:rPr>
-        <w:t>2. Executive concept summary</w:t>
-      </w:r>
+        <w:t>3. Executive concept summary</w:t>
+      </w:r>
+      <w:bookmarkEnd w:id="3"/>
     </w:p>
     <w:p>
       <w:pPr>
@@ -643,15 +971,14 @@
       </w:r>
     </w:p>
     <w:p>
+      <w:bookmarkStart w:id="4" w:name="APFAF_section_4"/>
       <w:pPr>
         <w:pStyle w:val="Heading1"/>
       </w:pPr>
       <w:r>
-        <w:rPr>
-          <w:b w:val="0"/>
-        </w:rPr>
-        <w:t>3. Why this concept fits APFAF</w:t>
-      </w:r>
+        <w:t>4. Why this concept fits APFAF</w:t>
+      </w:r>
+      <w:bookmarkEnd w:id="4"/>
     </w:p>
     <w:p>
       <w:r>
@@ -758,15 +1085,14 @@
       </w:r>
     </w:p>
     <w:p>
+      <w:bookmarkStart w:id="5" w:name="APFAF_section_5"/>
       <w:pPr>
         <w:pStyle w:val="Heading1"/>
       </w:pPr>
       <w:r>
-        <w:rPr>
-          <w:b w:val="0"/>
-        </w:rPr>
-        <w:t>4. Mandatory concept-validation gates</w:t>
-      </w:r>
+        <w:t>5. Mandatory concept-validation gates</w:t>
+      </w:r>
+      <w:bookmarkEnd w:id="5"/>
     </w:p>
     <w:p>
       <w:pPr>
@@ -1154,15 +1480,14 @@
       </w:r>
     </w:p>
     <w:p>
+      <w:bookmarkStart w:id="6" w:name="APFAF_section_6"/>
       <w:pPr>
         <w:pStyle w:val="Heading1"/>
       </w:pPr>
       <w:r>
-        <w:rPr>
-          <w:b w:val="0"/>
-        </w:rPr>
-        <w:t>5. Problem statement: writing instructions</w:t>
-      </w:r>
+        <w:t>6. Problem statement: writing instructions</w:t>
+      </w:r>
+      <w:bookmarkEnd w:id="6"/>
     </w:p>
     <w:p>
       <w:r>
@@ -1300,15 +1625,14 @@
       </w:r>
     </w:p>
     <w:p>
+      <w:bookmarkStart w:id="7" w:name="APFAF_section_7"/>
       <w:pPr>
         <w:pStyle w:val="Heading1"/>
       </w:pPr>
       <w:r>
-        <w:rPr>
-          <w:b w:val="0"/>
-        </w:rPr>
-        <w:t>6. Theory of change</w:t>
-      </w:r>
+        <w:t>7. Theory of change</w:t>
+      </w:r>
+      <w:bookmarkEnd w:id="7"/>
     </w:p>
     <w:p>
       <w:r>
@@ -1443,15 +1767,14 @@
       </w:r>
     </w:p>
     <w:p>
+      <w:bookmarkStart w:id="8" w:name="APFAF_section_8"/>
       <w:pPr>
         <w:pStyle w:val="Heading1"/>
       </w:pPr>
       <w:r>
-        <w:rPr>
-          <w:b w:val="0"/>
-        </w:rPr>
-        <w:t>7. Proposed results framework</w:t>
-      </w:r>
+        <w:t>8. Proposed results framework</w:t>
+      </w:r>
+      <w:bookmarkEnd w:id="8"/>
     </w:p>
     <w:p>
       <w:r>
@@ -2080,15 +2403,14 @@
       </w:r>
     </w:p>
     <w:p>
+      <w:bookmarkStart w:id="9" w:name="APFAF_section_9"/>
       <w:pPr>
         <w:pStyle w:val="Heading1"/>
       </w:pPr>
       <w:r>
-        <w:rPr>
-          <w:b w:val="0"/>
-        </w:rPr>
-        <w:t>8. Partner and governance structure</w:t>
-      </w:r>
+        <w:t>9. Partner and governance structure</w:t>
+      </w:r>
+      <w:bookmarkEnd w:id="9"/>
     </w:p>
     <w:tbl>
       <w:tblPr>
@@ -2287,15 +2609,14 @@
       </w:r>
     </w:p>
     <w:p>
+      <w:bookmarkStart w:id="10" w:name="APFAF_section_10"/>
       <w:pPr>
         <w:pStyle w:val="Heading1"/>
       </w:pPr>
       <w:r>
-        <w:rPr>
-          <w:b w:val="0"/>
-        </w:rPr>
-        <w:t>9. Safeguards, rights and inclusion</w:t>
-      </w:r>
+        <w:t>10. Safeguards, rights and inclusion</w:t>
+      </w:r>
+      <w:bookmarkEnd w:id="10"/>
     </w:p>
     <w:p>
       <w:r>
@@ -2432,15 +2753,14 @@
       </w:r>
     </w:p>
     <w:p>
+      <w:bookmarkStart w:id="11" w:name="APFAF_section_11"/>
       <w:pPr>
         <w:pStyle w:val="Heading1"/>
       </w:pPr>
       <w:r>
-        <w:rPr>
-          <w:b w:val="0"/>
-        </w:rPr>
-        <w:t>10. Implementation sequence</w:t>
-      </w:r>
+        <w:t>11. Implementation sequence</w:t>
+      </w:r>
+      <w:bookmarkEnd w:id="11"/>
     </w:p>
     <w:tbl>
       <w:tblPr>
@@ -2659,15 +2979,14 @@
       </w:r>
     </w:p>
     <w:p>
+      <w:bookmarkStart w:id="12" w:name="APFAF_section_12"/>
       <w:pPr>
         <w:pStyle w:val="Heading1"/>
       </w:pPr>
       <w:r>
-        <w:rPr>
-          <w:b w:val="0"/>
-        </w:rPr>
-        <w:t>11. Illustrative budget envelope</w:t>
-      </w:r>
+        <w:t>12. Illustrative budget envelope</w:t>
+      </w:r>
+      <w:bookmarkEnd w:id="12"/>
     </w:p>
     <w:p>
       <w:r>
@@ -3153,15 +3472,14 @@
       </w:r>
     </w:p>
     <w:p>
+      <w:bookmarkStart w:id="13" w:name="APFAF_section_13"/>
       <w:pPr>
         <w:pStyle w:val="Heading1"/>
       </w:pPr>
       <w:r>
-        <w:rPr>
-          <w:b w:val="0"/>
-        </w:rPr>
-        <w:t>12. Sustainability and exit strategy</w:t>
-      </w:r>
+        <w:t>13. Sustainability and exit strategy</w:t>
+      </w:r>
+      <w:bookmarkEnd w:id="13"/>
     </w:p>
     <w:p>
       <w:r>
@@ -3388,15 +3706,14 @@
       </w:r>
     </w:p>
     <w:p>
+      <w:bookmarkStart w:id="14" w:name="APFAF_section_14"/>
       <w:pPr>
         <w:pStyle w:val="Heading1"/>
       </w:pPr>
       <w:r>
-        <w:rPr>
-          <w:b w:val="0"/>
-        </w:rPr>
-        <w:t>13. Evidence and writing assignments</w:t>
-      </w:r>
+        <w:t>14. Evidence and writing assignments</w:t>
+      </w:r>
+      <w:bookmarkEnd w:id="14"/>
     </w:p>
     <w:tbl>
       <w:tblPr>
@@ -3913,15 +4230,14 @@
       </w:r>
     </w:p>
     <w:p>
+      <w:bookmarkStart w:id="15" w:name="APFAF_section_15"/>
       <w:pPr>
         <w:pStyle w:val="Heading1"/>
       </w:pPr>
       <w:r>
-        <w:rPr>
-          <w:b w:val="0"/>
-        </w:rPr>
-        <w:t>14. Application preparation and deadline plan</w:t>
-      </w:r>
+        <w:t>15. Application preparation and deadline plan</w:t>
+      </w:r>
+      <w:bookmarkEnd w:id="15"/>
     </w:p>
     <w:p>
       <w:r>
@@ -4108,15 +4424,14 @@
       </w:r>
     </w:p>
     <w:p>
+      <w:bookmarkStart w:id="16" w:name="APFAF_section_16"/>
       <w:pPr>
         <w:pStyle w:val="Heading1"/>
       </w:pPr>
       <w:r>
-        <w:rPr>
-          <w:b w:val="0"/>
-        </w:rPr>
-        <w:t>15. Final review and go/no-go decision</w:t>
-      </w:r>
+        <w:t>16. Final review and go/no-go decision</w:t>
+      </w:r>
+      <w:bookmarkEnd w:id="16"/>
     </w:p>
     <w:p>
       <w:r>
@@ -4278,15 +4593,14 @@
       </w:r>
     </w:p>
     <w:p>
+      <w:bookmarkStart w:id="17" w:name="APFAF_section_17"/>
       <w:pPr>
         <w:pStyle w:val="Heading1"/>
       </w:pPr>
       <w:r>
-        <w:rPr>
-          <w:b w:val="0"/>
-        </w:rPr>
-        <w:t>16. Source register</w:t>
-      </w:r>
+        <w:t>17. Source register</w:t>
+      </w:r>
+      <w:bookmarkEnd w:id="17"/>
     </w:p>
     <w:p>
       <w:r>
@@ -4350,6 +4664,16 @@
           <w:b w:val="0"/>
         </w:rPr>
         <w:t>7. Core Indicator Framework, August 2026: https://globalebafund.org/wp-content/uploads/2026/08/Global-EbA-Fund-Core-Indicator-Framework_August-2026.pdf</w:t>
+      </w:r>
+    </w:p>
+    <w:p>
+      <w:r>
+        <w:t>8. Global EbA Fund — Medium-size grants: https://globalebafund.org/medium-size-grants/</w:t>
+      </w:r>
+    </w:p>
+    <w:p>
+      <w:r>
+        <w:t>9. Global EbA Fund — USD 7.5 million announcement: https://globalebafund.org/news/the-global-eba-fund-announces-usd-7-5-million-in-grants-for-ecosystem-based-adaptation/</w:t>
       </w:r>
     </w:p>
     <w:p>

</xml_diff>